<commit_message>
Rebuild English DevOps Engineering programme with the cold-read fixes
Co-Authored-By: Claude Opus 5.5 <noreply@anthropic.com>
</commit_message>
<xml_diff>
--- a/res/programmes/DevOps-Engineering-81h.docx
+++ b/res/programmes/DevOps-Engineering-81h.docx
@@ -64,7 +64,7 @@
         <w:pStyle w:val="ProgCoverSub"/>
       </w:pPr>
       <w:r>
-        <w:t>Professional Training Curriculum</w:t>
+        <w:t>Build, deliver and run software through one automated pipeline</w:t>
       </w:r>
     </w:p>
     <w:p>
@@ -106,7 +106,7 @@
         <w:t>Prepares for</w:t>
       </w:r>
       <w:r>
-        <w:t xml:space="preserve">   LPI DevOps Tools Engineer  ·  HashiCorp Terraform Associate  ·  GitHub Actions</w:t>
+        <w:t xml:space="preserve">   HashiCorp Terraform Associate  ·  GitHub Actions (GH-200)  ·  LPI DevOps Tools Engineer (core topics)</w:t>
       </w:r>
     </w:p>
     <w:tbl>
@@ -212,7 +212,7 @@
         <w:pStyle w:val="ProgBody"/>
       </w:pPr>
       <w:r>
-        <w:t>This programme takes participants from a shared Git repository to a monitored application running in production, using the tools teams actually run today. It follows the path of a single change: version control and collaboration, continuous integration and delivery with Jenkins and GitHub Actions, code quality and artifact management, infrastructure provisioned with Terraform and configured with Ansible, then metrics and alerts with Prometheus and Grafana. Every chapter is hands-on, the same application is carried through all phases, and the programme ends with a final project that assembles the whole delivery chain.</w:t>
+        <w:t>This programme follows a single change from a developer's commit to a monitored application running on AWS. Participants set up Git collaboration, build continuous integration and delivery pipelines with Jenkins and GitHub Actions, add automated tests, quality gates and versioned artifacts, provision the infrastructure with Terraform and configure servers with Ansible, then watch the result through metrics, logs and alerts. The same application is carried through every phase, almost every chapter ends with a lab, and the programme closes with a final project in which teams assemble the whole delivery chain and present it.</w:t>
       </w:r>
     </w:p>
     <w:p>
@@ -349,7 +349,7 @@
               <w:keepNext/>
             </w:pPr>
             <w:r>
-              <w:t>12 h</w:t>
+              <w:t>9 h</w:t>
             </w:r>
           </w:p>
         </w:tc>
@@ -393,7 +393,7 @@
               <w:keepNext/>
             </w:pPr>
             <w:r>
-              <w:t>Jenkins, GitHub Actions, SonarQube, Nexus</w:t>
+              <w:t>Jenkins, automated tests, SonarQube, Nexus, deployment strategies, GitHub Actions</w:t>
             </w:r>
           </w:p>
         </w:tc>
@@ -407,7 +407,7 @@
               <w:keepNext/>
             </w:pPr>
             <w:r>
-              <w:t>21 h</w:t>
+              <w:t>24 h</w:t>
             </w:r>
           </w:p>
         </w:tc>
@@ -451,7 +451,7 @@
               <w:keepNext/>
             </w:pPr>
             <w:r>
-              <w:t>Ansible configuration management, Terraform provisioning</w:t>
+              <w:t>Terraform provisioning on AWS, Ansible configuration management</w:t>
             </w:r>
           </w:p>
         </w:tc>
@@ -465,7 +465,7 @@
               <w:keepNext/>
             </w:pPr>
             <w:r>
-              <w:t>24 h</w:t>
+              <w:t>24 h</w:t>
             </w:r>
           </w:p>
         </w:tc>
@@ -509,7 +509,7 @@
               <w:keepNext/>
             </w:pPr>
             <w:r>
-              <w:t>Prometheus metrics and alerts, Grafana dashboards</w:t>
+              <w:t>Prometheus metrics and alerts, Grafana dashboards and Loki logs</w:t>
             </w:r>
           </w:p>
         </w:tc>
@@ -523,7 +523,7 @@
               <w:keepNext/>
             </w:pPr>
             <w:r>
-              <w:t>6 h</w:t>
+              <w:t>6 h</w:t>
             </w:r>
           </w:p>
         </w:tc>
@@ -581,7 +581,7 @@
               <w:keepNext/>
             </w:pPr>
             <w:r>
-              <w:t>9 h</w:t>
+              <w:t>9 h</w:t>
             </w:r>
           </w:p>
         </w:tc>
@@ -604,11 +604,11 @@
           </w:tcPr>
           <w:p>
             <w:pPr>
-              <w:pStyle w:val="ProgTableMuted"/>
+              <w:pStyle w:val="ProgTableStrong"/>
               <w:keepNext/>
             </w:pPr>
             <w:r>
-              <w:t>Buffer: catch-up, revision, extra lab time</w:t>
+              <w:t>Buffer</w:t>
             </w:r>
           </w:p>
         </w:tc>
@@ -618,9 +618,12 @@
           </w:tcPr>
           <w:p>
             <w:pPr>
-              <w:pStyle w:val="ProgTableText"/>
+              <w:pStyle w:val="ProgTableMuted"/>
               <w:keepNext/>
             </w:pPr>
+            <w:r>
+              <w:t>Catch-up, revision, extra lab time</w:t>
+            </w:r>
           </w:p>
         </w:tc>
         <w:tc>
@@ -633,7 +636,7 @@
               <w:keepNext/>
             </w:pPr>
             <w:r>
-              <w:t>9 h</w:t>
+              <w:t>9 h</w:t>
             </w:r>
           </w:p>
         </w:tc>
@@ -697,7 +700,7 @@
               <w:keepNext/>
             </w:pPr>
             <w:r>
-              <w:t>81 h</w:t>
+              <w:t>81 h</w:t>
             </w:r>
           </w:p>
         </w:tc>
@@ -779,7 +782,7 @@
               <w:pStyle w:val="ProgTableText"/>
             </w:pPr>
             <w:r>
-              <w:t>Linux command line and Bash (course: Linux &amp; Bash Scripting); Docker and Kubernetes basics (course: Docker &amp; Kubernetes)</w:t>
+              <w:t>Linux command line and Bash (course: Linux &amp; Bash Scripting); Docker and Kubernetes basics (course: Docker &amp; Kubernetes). This course builds on Docker &amp; Kubernetes and does not repeat it.</w:t>
             </w:r>
           </w:p>
         </w:tc>
@@ -850,6 +853,34 @@
               <w:pStyle w:val="ProgTableKey"/>
             </w:pPr>
             <w:r>
+              <w:t>Lab environment</w:t>
+            </w:r>
+          </w:p>
+        </w:tc>
+        <w:tc>
+          <w:tcPr>
+            <w:tcW w:type="dxa" w:w="7257"/>
+          </w:tcPr>
+          <w:p>
+            <w:pPr>
+              <w:pStyle w:val="ProgTableText"/>
+            </w:pPr>
+            <w:r>
+              <w:t>One laptop per participant (16 GB RAM, Docker, VS Code) and an AWS sandbox account per participant, provided by the organiser</w:t>
+            </w:r>
+          </w:p>
+        </w:tc>
+      </w:tr>
+      <w:tr>
+        <w:tc>
+          <w:tcPr>
+            <w:tcW w:type="dxa" w:w="2381"/>
+          </w:tcPr>
+          <w:p>
+            <w:pPr>
+              <w:pStyle w:val="ProgTableKey"/>
+            </w:pPr>
+            <w:r>
               <w:t>Assessment</w:t>
             </w:r>
           </w:p>
@@ -863,7 +894,7 @@
               <w:pStyle w:val="ProgTableText"/>
             </w:pPr>
             <w:r>
-              <w:t>Lab completion per phase and a final project presented to the group</w:t>
+              <w:t>A lab validated at the end of each phase and a final project presented to the group; certificate of completion for participants who complete both</w:t>
             </w:r>
           </w:p>
         </w:tc>
@@ -891,7 +922,7 @@
               <w:pStyle w:val="ProgTableText"/>
             </w:pPr>
             <w:r>
-              <w:t>Participants can build, secure the quality of, deploy and monitor an application through a complete automated pipeline</w:t>
+              <w:t>Participants can take an application from commit to production through an automated pipeline with tests, quality gates, versioned artifacts, infrastructure as code, and monitoring with alerts</w:t>
             </w:r>
           </w:p>
         </w:tc>
@@ -918,7 +949,7 @@
       <w:r>
         <w:t>Phase 01</w:t>
         <w:tab/>
-        <w:t>12 h</w:t>
+        <w:t>9 h</w:t>
       </w:r>
     </w:p>
     <w:p>
@@ -934,7 +965,7 @@
         <w:pStyle w:val="ProgIntro"/>
       </w:pPr>
       <w:r>
-        <w:t>DevOps starts with how a team works, then with how it shares code. This phase sets the vocabulary and metrics used for the rest of the programme, and makes every participant fluent with Git and pull-request based collaboration.</w:t>
+        <w:t>DevOps starts with how a team works, then with how it shares code. This phase sets the vocabulary and metrics used for the rest of the programme and gives every participant a working command of Git and pull-request based collaboration.</w:t>
       </w:r>
     </w:p>
     <w:tbl>
@@ -1056,7 +1087,7 @@
               <w:pStyle w:val="ProgTableText"/>
             </w:pPr>
             <w:r>
-              <w:t>CALMS, the four DORA metrics, Agile and Kanban, value streams, where automation pays off</w:t>
+              <w:t>CALMS, DORA software delivery metrics, Agile and Kanban, value stream mapping, where automation pays off</w:t>
             </w:r>
           </w:p>
         </w:tc>
@@ -1082,7 +1113,7 @@
               <w:pStyle w:val="ProgTableHours"/>
             </w:pPr>
             <w:r>
-              <w:t>3 h</w:t>
+              <w:t>3 h</w:t>
             </w:r>
           </w:p>
         </w:tc>
@@ -1110,7 +1141,7 @@
               <w:pStyle w:val="ProgTableStrong"/>
             </w:pPr>
             <w:r>
-              <w:t>Git Internals</w:t>
+              <w:t>Git Fundamentals</w:t>
             </w:r>
           </w:p>
         </w:tc>
@@ -1123,7 +1154,7 @@
               <w:pStyle w:val="ProgTableText"/>
             </w:pPr>
             <w:r>
-              <w:t>Why version control, distributed vs centralised, blobs, trees, commits and tags, the .git directory</w:t>
+              <w:t>How Git stores history (commits, trees, refs), init, clone, add, commit, log, diff, .gitignore, commit message conventions</w:t>
             </w:r>
           </w:p>
         </w:tc>
@@ -1149,7 +1180,7 @@
               <w:pStyle w:val="ProgTableHours"/>
             </w:pPr>
             <w:r>
-              <w:t>1.5 h</w:t>
+              <w:t>1.5 h</w:t>
             </w:r>
           </w:p>
         </w:tc>
@@ -1165,73 +1196,6 @@
             </w:pPr>
             <w:r>
               <w:t>1.3</w:t>
-            </w:r>
-          </w:p>
-        </w:tc>
-        <w:tc>
-          <w:tcPr>
-            <w:tcW w:type="dxa" w:w="2211"/>
-          </w:tcPr>
-          <w:p>
-            <w:pPr>
-              <w:pStyle w:val="ProgTableStrong"/>
-            </w:pPr>
-            <w:r>
-              <w:t>Core Git Workflow</w:t>
-            </w:r>
-          </w:p>
-        </w:tc>
-        <w:tc>
-          <w:tcPr>
-            <w:tcW w:type="dxa" w:w="4876"/>
-          </w:tcPr>
-          <w:p>
-            <w:pPr>
-              <w:pStyle w:val="ProgTableText"/>
-            </w:pPr>
-            <w:r>
-              <w:t>init, clone, add, commit, status, log, diff, .gitignore, commit message conventions, atomic commits</w:t>
-            </w:r>
-          </w:p>
-        </w:tc>
-        <w:tc>
-          <w:tcPr>
-            <w:tcW w:type="dxa" w:w="1134"/>
-          </w:tcPr>
-          <w:p>
-            <w:pPr>
-              <w:pStyle w:val="ProgTableMuted"/>
-            </w:pPr>
-            <w:r>
-              <w:t>Lecture + Lab</w:t>
-            </w:r>
-          </w:p>
-        </w:tc>
-        <w:tc>
-          <w:tcPr>
-            <w:tcW w:type="dxa" w:w="850"/>
-          </w:tcPr>
-          <w:p>
-            <w:pPr>
-              <w:pStyle w:val="ProgTableHours"/>
-            </w:pPr>
-            <w:r>
-              <w:t>1.5 h</w:t>
-            </w:r>
-          </w:p>
-        </w:tc>
-      </w:tr>
-      <w:tr>
-        <w:tc>
-          <w:tcPr>
-            <w:tcW w:type="dxa" w:w="567"/>
-          </w:tcPr>
-          <w:p>
-            <w:pPr>
-              <w:pStyle w:val="ProgTableId"/>
-            </w:pPr>
-            <w:r>
-              <w:t>1.4</w:t>
             </w:r>
           </w:p>
         </w:tc>
@@ -1283,7 +1247,74 @@
               <w:pStyle w:val="ProgTableHours"/>
             </w:pPr>
             <w:r>
-              <w:t>1.5 h</w:t>
+              <w:t>1.5 h</w:t>
+            </w:r>
+          </w:p>
+        </w:tc>
+      </w:tr>
+      <w:tr>
+        <w:tc>
+          <w:tcPr>
+            <w:tcW w:type="dxa" w:w="567"/>
+          </w:tcPr>
+          <w:p>
+            <w:pPr>
+              <w:pStyle w:val="ProgTableId"/>
+            </w:pPr>
+            <w:r>
+              <w:t>1.4</w:t>
+            </w:r>
+          </w:p>
+        </w:tc>
+        <w:tc>
+          <w:tcPr>
+            <w:tcW w:type="dxa" w:w="2211"/>
+          </w:tcPr>
+          <w:p>
+            <w:pPr>
+              <w:pStyle w:val="ProgTableStrong"/>
+            </w:pPr>
+            <w:r>
+              <w:t>Remote Repositories &amp; Pull Requests</w:t>
+            </w:r>
+          </w:p>
+        </w:tc>
+        <w:tc>
+          <w:tcPr>
+            <w:tcW w:type="dxa" w:w="4876"/>
+          </w:tcPr>
+          <w:p>
+            <w:pPr>
+              <w:pStyle w:val="ProgTableText"/>
+            </w:pPr>
+            <w:r>
+              <w:t>fetch, pull, push, SSH vs HTTPS authentication, forks, origin and upstream, pull requests and code review</w:t>
+            </w:r>
+          </w:p>
+        </w:tc>
+        <w:tc>
+          <w:tcPr>
+            <w:tcW w:type="dxa" w:w="1134"/>
+          </w:tcPr>
+          <w:p>
+            <w:pPr>
+              <w:pStyle w:val="ProgTableMuted"/>
+            </w:pPr>
+            <w:r>
+              <w:t>Lecture + Lab</w:t>
+            </w:r>
+          </w:p>
+        </w:tc>
+        <w:tc>
+          <w:tcPr>
+            <w:tcW w:type="dxa" w:w="850"/>
+          </w:tcPr>
+          <w:p>
+            <w:pPr>
+              <w:pStyle w:val="ProgTableHours"/>
+            </w:pPr>
+            <w:r>
+              <w:t>1.5 h</w:t>
             </w:r>
           </w:p>
         </w:tc>
@@ -1311,7 +1342,7 @@
               <w:pStyle w:val="ProgTableStrong"/>
             </w:pPr>
             <w:r>
-              <w:t>Remote Repositories &amp; GitHub</w:t>
+              <w:t>Team Workflow</w:t>
             </w:r>
           </w:p>
         </w:tc>
@@ -1324,7 +1355,7 @@
               <w:pStyle w:val="ProgTableText"/>
             </w:pPr>
             <w:r>
-              <w:t>fetch, pull, push, SSH vs HTTPS authentication, forks, origin and upstream, pull requests</w:t>
+              <w:t>GitFlow vs trunk-based development, branch protection rules, release tags, semantic versioning</w:t>
             </w:r>
           </w:p>
         </w:tc>
@@ -1350,74 +1381,7 @@
               <w:pStyle w:val="ProgTableHours"/>
             </w:pPr>
             <w:r>
-              <w:t>1.5 h</w:t>
-            </w:r>
-          </w:p>
-        </w:tc>
-      </w:tr>
-      <w:tr>
-        <w:tc>
-          <w:tcPr>
-            <w:tcW w:type="dxa" w:w="567"/>
-          </w:tcPr>
-          <w:p>
-            <w:pPr>
-              <w:pStyle w:val="ProgTableId"/>
-            </w:pPr>
-            <w:r>
-              <w:t>1.6</w:t>
-            </w:r>
-          </w:p>
-        </w:tc>
-        <w:tc>
-          <w:tcPr>
-            <w:tcW w:type="dxa" w:w="2211"/>
-          </w:tcPr>
-          <w:p>
-            <w:pPr>
-              <w:pStyle w:val="ProgTableStrong"/>
-            </w:pPr>
-            <w:r>
-              <w:t>Team Workflow</w:t>
-            </w:r>
-          </w:p>
-        </w:tc>
-        <w:tc>
-          <w:tcPr>
-            <w:tcW w:type="dxa" w:w="4876"/>
-          </w:tcPr>
-          <w:p>
-            <w:pPr>
-              <w:pStyle w:val="ProgTableText"/>
-            </w:pPr>
-            <w:r>
-              <w:t>GitFlow vs trunk-based development, code review, branch protection rules, release tags, semantic versioning</w:t>
-            </w:r>
-          </w:p>
-        </w:tc>
-        <w:tc>
-          <w:tcPr>
-            <w:tcW w:type="dxa" w:w="1134"/>
-          </w:tcPr>
-          <w:p>
-            <w:pPr>
-              <w:pStyle w:val="ProgTableMuted"/>
-            </w:pPr>
-            <w:r>
-              <w:t>Lecture + Lab</w:t>
-            </w:r>
-          </w:p>
-        </w:tc>
-        <w:tc>
-          <w:tcPr>
-            <w:tcW w:type="dxa" w:w="850"/>
-          </w:tcPr>
-          <w:p>
-            <w:pPr>
-              <w:pStyle w:val="ProgTableHours"/>
-            </w:pPr>
-            <w:r>
-              <w:t>3 h</w:t>
+              <w:t>1.5 h</w:t>
             </w:r>
           </w:p>
         </w:tc>
@@ -1444,7 +1408,7 @@
       <w:r>
         <w:t>Phase 02</w:t>
         <w:tab/>
-        <w:t>21 h</w:t>
+        <w:t>24 h</w:t>
       </w:r>
     </w:p>
     <w:p>
@@ -1460,7 +1424,7 @@
         <w:pStyle w:val="ProgIntro"/>
       </w:pPr>
       <w:r>
-        <w:t>Participants build the same pipeline twice: on a self-hosted Jenkins server, as most companies run on premises, and on GitHub Actions, as most cloud-native teams do. Code quality gates and artifact management are added so that only tested, versioned builds move forward.</w:t>
+        <w:t>Participants build the same pipeline twice: on Jenkins, the most widespread self-hosted CI server, and on GitHub Actions. Tests, quality gates and an artifact repository make sure that only tested, versioned builds are deployed, and the phase ends with the release strategies that keep a deployment reversible.</w:t>
       </w:r>
     </w:p>
     <w:tbl>
@@ -1582,7 +1546,7 @@
               <w:pStyle w:val="ProgTableText"/>
             </w:pPr>
             <w:r>
-              <w:t>Installation, plugins, security settings, controller and agent architecture, job types</w:t>
+              <w:t>Installation, plugins, security settings, controller and agents, job types</w:t>
             </w:r>
           </w:p>
         </w:tc>
@@ -1608,7 +1572,7 @@
               <w:pStyle w:val="ProgTableHours"/>
             </w:pPr>
             <w:r>
-              <w:t>1.5 h</w:t>
+              <w:t>1.5 h</w:t>
             </w:r>
           </w:p>
         </w:tc>
@@ -1636,7 +1600,7 @@
               <w:pStyle w:val="ProgTableStrong"/>
             </w:pPr>
             <w:r>
-              <w:t>Jenkins Pipelines</w:t>
+              <w:t>Triggers &amp; Credentials</w:t>
             </w:r>
           </w:p>
         </w:tc>
@@ -1649,7 +1613,7 @@
               <w:pStyle w:val="ProgTableText"/>
             </w:pPr>
             <w:r>
-              <w:t>Declarative pipelines, stages and steps, post actions, parameters, environment variables</w:t>
+              <w:t>Webhooks, SCM polling, scheduled builds, credential types and their safe use</w:t>
             </w:r>
           </w:p>
         </w:tc>
@@ -1675,7 +1639,7 @@
               <w:pStyle w:val="ProgTableHours"/>
             </w:pPr>
             <w:r>
-              <w:t>3 h</w:t>
+              <w:t>1.5 h</w:t>
             </w:r>
           </w:p>
         </w:tc>
@@ -1703,7 +1667,7 @@
               <w:pStyle w:val="ProgTableStrong"/>
             </w:pPr>
             <w:r>
-              <w:t>Triggers &amp; Credentials</w:t>
+              <w:t>Jenkins Pipelines</w:t>
             </w:r>
           </w:p>
         </w:tc>
@@ -1716,7 +1680,7 @@
               <w:pStyle w:val="ProgTableText"/>
             </w:pPr>
             <w:r>
-              <w:t>Webhooks, SCM polling, scheduled builds, credential types and secure use in pipelines</w:t>
+              <w:t>Declarative Jenkinsfile, stages and steps, post actions, parameters, environment variables</w:t>
             </w:r>
           </w:p>
         </w:tc>
@@ -1742,7 +1706,7 @@
               <w:pStyle w:val="ProgTableHours"/>
             </w:pPr>
             <w:r>
-              <w:t>1.5 h</w:t>
+              <w:t>3 h</w:t>
             </w:r>
           </w:p>
         </w:tc>
@@ -1809,7 +1773,7 @@
               <w:pStyle w:val="ProgTableHours"/>
             </w:pPr>
             <w:r>
-              <w:t>1.5 h</w:t>
+              <w:t>1.5 h</w:t>
             </w:r>
           </w:p>
         </w:tc>
@@ -1837,6 +1801,207 @@
               <w:pStyle w:val="ProgTableStrong"/>
             </w:pPr>
             <w:r>
+              <w:t>Automated Testing in the Pipeline</w:t>
+            </w:r>
+          </w:p>
+        </w:tc>
+        <w:tc>
+          <w:tcPr>
+            <w:tcW w:type="dxa" w:w="4876"/>
+          </w:tcPr>
+          <w:p>
+            <w:pPr>
+              <w:pStyle w:val="ProgTableText"/>
+            </w:pPr>
+            <w:r>
+              <w:t>Unit and integration test stages, JUnit reports, failing fast, disposable test environments with containers</w:t>
+            </w:r>
+          </w:p>
+        </w:tc>
+        <w:tc>
+          <w:tcPr>
+            <w:tcW w:type="dxa" w:w="1134"/>
+          </w:tcPr>
+          <w:p>
+            <w:pPr>
+              <w:pStyle w:val="ProgTableMuted"/>
+            </w:pPr>
+            <w:r>
+              <w:t>Lecture + Lab</w:t>
+            </w:r>
+          </w:p>
+        </w:tc>
+        <w:tc>
+          <w:tcPr>
+            <w:tcW w:type="dxa" w:w="850"/>
+          </w:tcPr>
+          <w:p>
+            <w:pPr>
+              <w:pStyle w:val="ProgTableHours"/>
+            </w:pPr>
+            <w:r>
+              <w:t>1.5 h</w:t>
+            </w:r>
+          </w:p>
+        </w:tc>
+      </w:tr>
+      <w:tr>
+        <w:tc>
+          <w:tcPr>
+            <w:tcW w:type="dxa" w:w="567"/>
+          </w:tcPr>
+          <w:p>
+            <w:pPr>
+              <w:pStyle w:val="ProgTableId"/>
+            </w:pPr>
+            <w:r>
+              <w:t>2.6</w:t>
+            </w:r>
+          </w:p>
+        </w:tc>
+        <w:tc>
+          <w:tcPr>
+            <w:tcW w:type="dxa" w:w="2211"/>
+          </w:tcPr>
+          <w:p>
+            <w:pPr>
+              <w:pStyle w:val="ProgTableStrong"/>
+            </w:pPr>
+            <w:r>
+              <w:t>Code Quality with SonarQube</w:t>
+            </w:r>
+          </w:p>
+        </w:tc>
+        <w:tc>
+          <w:tcPr>
+            <w:tcW w:type="dxa" w:w="4876"/>
+          </w:tcPr>
+          <w:p>
+            <w:pPr>
+              <w:pStyle w:val="ProgTableText"/>
+            </w:pPr>
+            <w:r>
+              <w:t>Static analysis, coverage import, quality profiles, quality gates that stop the pipeline</w:t>
+            </w:r>
+          </w:p>
+        </w:tc>
+        <w:tc>
+          <w:tcPr>
+            <w:tcW w:type="dxa" w:w="1134"/>
+          </w:tcPr>
+          <w:p>
+            <w:pPr>
+              <w:pStyle w:val="ProgTableMuted"/>
+            </w:pPr>
+            <w:r>
+              <w:t>Lecture + Lab</w:t>
+            </w:r>
+          </w:p>
+        </w:tc>
+        <w:tc>
+          <w:tcPr>
+            <w:tcW w:type="dxa" w:w="850"/>
+          </w:tcPr>
+          <w:p>
+            <w:pPr>
+              <w:pStyle w:val="ProgTableHours"/>
+            </w:pPr>
+            <w:r>
+              <w:t>3 h</w:t>
+            </w:r>
+          </w:p>
+        </w:tc>
+      </w:tr>
+      <w:tr>
+        <w:tc>
+          <w:tcPr>
+            <w:tcW w:type="dxa" w:w="567"/>
+          </w:tcPr>
+          <w:p>
+            <w:pPr>
+              <w:pStyle w:val="ProgTableId"/>
+            </w:pPr>
+            <w:r>
+              <w:t>2.7</w:t>
+            </w:r>
+          </w:p>
+        </w:tc>
+        <w:tc>
+          <w:tcPr>
+            <w:tcW w:type="dxa" w:w="2211"/>
+          </w:tcPr>
+          <w:p>
+            <w:pPr>
+              <w:pStyle w:val="ProgTableStrong"/>
+            </w:pPr>
+            <w:r>
+              <w:t>Artifact Management with Nexus</w:t>
+            </w:r>
+          </w:p>
+        </w:tc>
+        <w:tc>
+          <w:tcPr>
+            <w:tcW w:type="dxa" w:w="4876"/>
+          </w:tcPr>
+          <w:p>
+            <w:pPr>
+              <w:pStyle w:val="ProgTableText"/>
+            </w:pPr>
+            <w:r>
+              <w:t>Hosted, proxy and group repositories, Nexus as a Docker registry, versioning, cleanup policies, publishing from the pipeline</w:t>
+            </w:r>
+          </w:p>
+        </w:tc>
+        <w:tc>
+          <w:tcPr>
+            <w:tcW w:type="dxa" w:w="1134"/>
+          </w:tcPr>
+          <w:p>
+            <w:pPr>
+              <w:pStyle w:val="ProgTableMuted"/>
+            </w:pPr>
+            <w:r>
+              <w:t>Lecture + Lab</w:t>
+            </w:r>
+          </w:p>
+        </w:tc>
+        <w:tc>
+          <w:tcPr>
+            <w:tcW w:type="dxa" w:w="850"/>
+          </w:tcPr>
+          <w:p>
+            <w:pPr>
+              <w:pStyle w:val="ProgTableHours"/>
+            </w:pPr>
+            <w:r>
+              <w:t>3 h</w:t>
+            </w:r>
+          </w:p>
+        </w:tc>
+      </w:tr>
+      <w:tr>
+        <w:tc>
+          <w:tcPr>
+            <w:tcW w:type="dxa" w:w="567"/>
+          </w:tcPr>
+          <w:p>
+            <w:pPr>
+              <w:pStyle w:val="ProgTableId"/>
+            </w:pPr>
+            <w:r>
+              <w:t>2.8</w:t>
+            </w:r>
+          </w:p>
+        </w:tc>
+        <w:tc>
+          <w:tcPr>
+            <w:tcW w:type="dxa" w:w="2211"/>
+          </w:tcPr>
+          <w:p>
+            <w:pPr>
+              <w:pStyle w:val="ProgTableStrong"/>
+            </w:pPr>
+            <w:r>
               <w:t>Deploying from Jenkins</w:t>
             </w:r>
           </w:p>
@@ -1850,7 +2015,7 @@
               <w:pStyle w:val="ProgTableText"/>
             </w:pPr>
             <w:r>
-              <w:t>Build and push container images, deploy to Kubernetes, archive artifacts</w:t>
+              <w:t>Build, tag and push images to Nexus, deploy to Kubernetes with Helm, promotion between environments</w:t>
             </w:r>
           </w:p>
         </w:tc>
@@ -1876,7 +2041,7 @@
               <w:pStyle w:val="ProgTableHours"/>
             </w:pPr>
             <w:r>
-              <w:t>1.5 h</w:t>
+              <w:t>1.5 h</w:t>
             </w:r>
           </w:p>
         </w:tc>
@@ -1891,7 +2056,74 @@
               <w:pStyle w:val="ProgTableId"/>
             </w:pPr>
             <w:r>
-              <w:t>2.6</w:t>
+              <w:t>2.9</w:t>
+            </w:r>
+          </w:p>
+        </w:tc>
+        <w:tc>
+          <w:tcPr>
+            <w:tcW w:type="dxa" w:w="2211"/>
+          </w:tcPr>
+          <w:p>
+            <w:pPr>
+              <w:pStyle w:val="ProgTableStrong"/>
+            </w:pPr>
+            <w:r>
+              <w:t>Deployment Strategies &amp; Rollback</w:t>
+            </w:r>
+          </w:p>
+        </w:tc>
+        <w:tc>
+          <w:tcPr>
+            <w:tcW w:type="dxa" w:w="4876"/>
+          </w:tcPr>
+          <w:p>
+            <w:pPr>
+              <w:pStyle w:val="ProgTableText"/>
+            </w:pPr>
+            <w:r>
+              <w:t>Rolling, blue/green and canary releases, rollback, feature flags; push-based deployment vs GitOps (Argo CD, taught in Docker &amp; Kubernetes)</w:t>
+            </w:r>
+          </w:p>
+        </w:tc>
+        <w:tc>
+          <w:tcPr>
+            <w:tcW w:type="dxa" w:w="1134"/>
+          </w:tcPr>
+          <w:p>
+            <w:pPr>
+              <w:pStyle w:val="ProgTableMuted"/>
+            </w:pPr>
+            <w:r>
+              <w:t>Lecture + Lab</w:t>
+            </w:r>
+          </w:p>
+        </w:tc>
+        <w:tc>
+          <w:tcPr>
+            <w:tcW w:type="dxa" w:w="850"/>
+          </w:tcPr>
+          <w:p>
+            <w:pPr>
+              <w:pStyle w:val="ProgTableHours"/>
+            </w:pPr>
+            <w:r>
+              <w:t>1.5 h</w:t>
+            </w:r>
+          </w:p>
+        </w:tc>
+      </w:tr>
+      <w:tr>
+        <w:tc>
+          <w:tcPr>
+            <w:tcW w:type="dxa" w:w="567"/>
+          </w:tcPr>
+          <w:p>
+            <w:pPr>
+              <w:pStyle w:val="ProgTableId"/>
+            </w:pPr>
+            <w:r>
+              <w:t>2.10</w:t>
             </w:r>
           </w:p>
         </w:tc>
@@ -1943,7 +2175,7 @@
               <w:pStyle w:val="ProgTableHours"/>
             </w:pPr>
             <w:r>
-              <w:t>3 h</w:t>
+              <w:t>3 h</w:t>
             </w:r>
           </w:p>
         </w:tc>
@@ -1958,7 +2190,7 @@
               <w:pStyle w:val="ProgTableId"/>
             </w:pPr>
             <w:r>
-              <w:t>2.7</w:t>
+              <w:t>2.11</w:t>
             </w:r>
           </w:p>
         </w:tc>
@@ -1984,7 +2216,7 @@
               <w:pStyle w:val="ProgTableText"/>
             </w:pPr>
             <w:r>
-              <w:t>Secrets, environments and approvals, OIDC federation to the cloud, deployment workflows</w:t>
+              <w:t>Secrets, environments and required reviewers, OIDC federation to AWS without long-lived keys, reusable workflows, deployment</w:t>
             </w:r>
           </w:p>
         </w:tc>
@@ -2010,141 +2242,7 @@
               <w:pStyle w:val="ProgTableHours"/>
             </w:pPr>
             <w:r>
-              <w:t>3 h</w:t>
-            </w:r>
-          </w:p>
-        </w:tc>
-      </w:tr>
-      <w:tr>
-        <w:tc>
-          <w:tcPr>
-            <w:tcW w:type="dxa" w:w="567"/>
-          </w:tcPr>
-          <w:p>
-            <w:pPr>
-              <w:pStyle w:val="ProgTableId"/>
-            </w:pPr>
-            <w:r>
-              <w:t>2.8</w:t>
-            </w:r>
-          </w:p>
-        </w:tc>
-        <w:tc>
-          <w:tcPr>
-            <w:tcW w:type="dxa" w:w="2211"/>
-          </w:tcPr>
-          <w:p>
-            <w:pPr>
-              <w:pStyle w:val="ProgTableStrong"/>
-            </w:pPr>
-            <w:r>
-              <w:t>Code Quality with SonarQube</w:t>
-            </w:r>
-          </w:p>
-        </w:tc>
-        <w:tc>
-          <w:tcPr>
-            <w:tcW w:type="dxa" w:w="4876"/>
-          </w:tcPr>
-          <w:p>
-            <w:pPr>
-              <w:pStyle w:val="ProgTableText"/>
-            </w:pPr>
-            <w:r>
-              <w:t>Static analysis, coverage reports, quality profiles, quality gates that block a pipeline</w:t>
-            </w:r>
-          </w:p>
-        </w:tc>
-        <w:tc>
-          <w:tcPr>
-            <w:tcW w:type="dxa" w:w="1134"/>
-          </w:tcPr>
-          <w:p>
-            <w:pPr>
-              <w:pStyle w:val="ProgTableMuted"/>
-            </w:pPr>
-            <w:r>
-              <w:t>Lecture + Lab</w:t>
-            </w:r>
-          </w:p>
-        </w:tc>
-        <w:tc>
-          <w:tcPr>
-            <w:tcW w:type="dxa" w:w="850"/>
-          </w:tcPr>
-          <w:p>
-            <w:pPr>
-              <w:pStyle w:val="ProgTableHours"/>
-            </w:pPr>
-            <w:r>
-              <w:t>3 h</w:t>
-            </w:r>
-          </w:p>
-        </w:tc>
-      </w:tr>
-      <w:tr>
-        <w:tc>
-          <w:tcPr>
-            <w:tcW w:type="dxa" w:w="567"/>
-          </w:tcPr>
-          <w:p>
-            <w:pPr>
-              <w:pStyle w:val="ProgTableId"/>
-            </w:pPr>
-            <w:r>
-              <w:t>2.9</w:t>
-            </w:r>
-          </w:p>
-        </w:tc>
-        <w:tc>
-          <w:tcPr>
-            <w:tcW w:type="dxa" w:w="2211"/>
-          </w:tcPr>
-          <w:p>
-            <w:pPr>
-              <w:pStyle w:val="ProgTableStrong"/>
-            </w:pPr>
-            <w:r>
-              <w:t>Artifact Management with Nexus</w:t>
-            </w:r>
-          </w:p>
-        </w:tc>
-        <w:tc>
-          <w:tcPr>
-            <w:tcW w:type="dxa" w:w="4876"/>
-          </w:tcPr>
-          <w:p>
-            <w:pPr>
-              <w:pStyle w:val="ProgTableText"/>
-            </w:pPr>
-            <w:r>
-              <w:t>Hosted, proxy and group repositories, versioning, retention policies, publishing from the pipeline</w:t>
-            </w:r>
-          </w:p>
-        </w:tc>
-        <w:tc>
-          <w:tcPr>
-            <w:tcW w:type="dxa" w:w="1134"/>
-          </w:tcPr>
-          <w:p>
-            <w:pPr>
-              <w:pStyle w:val="ProgTableMuted"/>
-            </w:pPr>
-            <w:r>
-              <w:t>Lecture + Lab</w:t>
-            </w:r>
-          </w:p>
-        </w:tc>
-        <w:tc>
-          <w:tcPr>
-            <w:tcW w:type="dxa" w:w="850"/>
-          </w:tcPr>
-          <w:p>
-            <w:pPr>
-              <w:pStyle w:val="ProgTableHours"/>
-            </w:pPr>
-            <w:r>
-              <w:t>3 h</w:t>
+              <w:t>3 h</w:t>
             </w:r>
           </w:p>
         </w:tc>
@@ -2171,7 +2269,7 @@
       <w:r>
         <w:t>Phase 03</w:t>
         <w:tab/>
-        <w:t>24 h</w:t>
+        <w:t>24 h</w:t>
       </w:r>
     </w:p>
     <w:p>
@@ -2187,7 +2285,7 @@
         <w:pStyle w:val="ProgIntro"/>
       </w:pPr>
       <w:r>
-        <w:t>Servers and cloud resources are described in code, reviewed like code and applied by the pipeline. Ansible configures machines; Terraform creates the infrastructure they run on. Each tool ends with a small project that the final project reuses.</w:t>
+        <w:t>Infrastructure is described in code, reviewed like code and applied by the pipeline. Terraform creates the AWS environment for the course application; Ansible then configures the servers that run the team's tooling. Each tool ends with a project that the final project reuses.</w:t>
       </w:r>
     </w:p>
     <w:tbl>
@@ -2296,7 +2394,7 @@
               <w:pStyle w:val="ProgTableStrong"/>
             </w:pPr>
             <w:r>
-              <w:t>IaC &amp; Ansible Basics</w:t>
+              <w:t>Terraform Foundations</w:t>
             </w:r>
           </w:p>
         </w:tc>
@@ -2309,7 +2407,7 @@
               <w:pStyle w:val="ProgTableText"/>
             </w:pPr>
             <w:r>
-              <w:t>Declarative vs imperative, configuration drift, Ansible architecture, static inventory, ad hoc commands</w:t>
+              <w:t>Providers, HCL, resources, data sources, dependency graph, init, plan and apply, fmt and validate</w:t>
             </w:r>
           </w:p>
         </w:tc>
@@ -2335,7 +2433,7 @@
               <w:pStyle w:val="ProgTableHours"/>
             </w:pPr>
             <w:r>
-              <w:t>3 h</w:t>
+              <w:t>3 h</w:t>
             </w:r>
           </w:p>
         </w:tc>
@@ -2363,7 +2461,7 @@
               <w:pStyle w:val="ProgTableStrong"/>
             </w:pPr>
             <w:r>
-              <w:t>Playbooks</w:t>
+              <w:t>State &amp; Variables</w:t>
             </w:r>
           </w:p>
         </w:tc>
@@ -2376,7 +2474,7 @@
               <w:pStyle w:val="ProgTableText"/>
             </w:pPr>
             <w:r>
-              <w:t>YAML, plays and tasks, core modules, handlers, conditionals, idempotency</w:t>
+              <w:t>Variables and validation, outputs, state and the terraform state commands, S3 remote backend and locking, HCP Terraform</w:t>
             </w:r>
           </w:p>
         </w:tc>
@@ -2402,7 +2500,7 @@
               <w:pStyle w:val="ProgTableHours"/>
             </w:pPr>
             <w:r>
-              <w:t>3 h</w:t>
+              <w:t>3 h</w:t>
             </w:r>
           </w:p>
         </w:tc>
@@ -2430,7 +2528,7 @@
               <w:pStyle w:val="ProgTableStrong"/>
             </w:pPr>
             <w:r>
-              <w:t>Variables, Templates &amp; Vault</w:t>
+              <w:t>Modules &amp; Environments</w:t>
             </w:r>
           </w:p>
         </w:tc>
@@ -2443,7 +2541,7 @@
               <w:pStyle w:val="ProgTableText"/>
             </w:pPr>
             <w:r>
-              <w:t>group_vars and host_vars, Jinja2 templates and filters, Ansible Vault for secrets</w:t>
+              <w:t>Writing and versioning modules, the Terraform Registry, workspaces, lifecycle rules, import and moved blocks, code organisation</w:t>
             </w:r>
           </w:p>
         </w:tc>
@@ -2469,7 +2567,7 @@
               <w:pStyle w:val="ProgTableHours"/>
             </w:pPr>
             <w:r>
-              <w:t>1.5 h</w:t>
+              <w:t>3 h</w:t>
             </w:r>
           </w:p>
         </w:tc>
@@ -2485,6 +2583,274 @@
             </w:pPr>
             <w:r>
               <w:t>3.4</w:t>
+            </w:r>
+          </w:p>
+        </w:tc>
+        <w:tc>
+          <w:tcPr>
+            <w:tcW w:type="dxa" w:w="2211"/>
+          </w:tcPr>
+          <w:p>
+            <w:pPr>
+              <w:pStyle w:val="ProgTableStrong"/>
+            </w:pPr>
+            <w:r>
+              <w:t>Terraform Project</w:t>
+            </w:r>
+          </w:p>
+        </w:tc>
+        <w:tc>
+          <w:tcPr>
+            <w:tcW w:type="dxa" w:w="4876"/>
+          </w:tcPr>
+          <w:p>
+            <w:pPr>
+              <w:pStyle w:val="ProgTableText"/>
+            </w:pPr>
+            <w:r>
+              <w:t>Provision the course environment on AWS: VPC, EKS cluster, RDS database and EC2 hosts for the tooling</w:t>
+            </w:r>
+          </w:p>
+        </w:tc>
+        <w:tc>
+          <w:tcPr>
+            <w:tcW w:type="dxa" w:w="1134"/>
+          </w:tcPr>
+          <w:p>
+            <w:pPr>
+              <w:pStyle w:val="ProgTableMuted"/>
+            </w:pPr>
+            <w:r>
+              <w:t>Lab</w:t>
+            </w:r>
+          </w:p>
+        </w:tc>
+        <w:tc>
+          <w:tcPr>
+            <w:tcW w:type="dxa" w:w="850"/>
+          </w:tcPr>
+          <w:p>
+            <w:pPr>
+              <w:pStyle w:val="ProgTableHours"/>
+            </w:pPr>
+            <w:r>
+              <w:t>3 h</w:t>
+            </w:r>
+          </w:p>
+        </w:tc>
+      </w:tr>
+      <w:tr>
+        <w:tc>
+          <w:tcPr>
+            <w:tcW w:type="dxa" w:w="567"/>
+          </w:tcPr>
+          <w:p>
+            <w:pPr>
+              <w:pStyle w:val="ProgTableId"/>
+            </w:pPr>
+            <w:r>
+              <w:t>3.5</w:t>
+            </w:r>
+          </w:p>
+        </w:tc>
+        <w:tc>
+          <w:tcPr>
+            <w:tcW w:type="dxa" w:w="2211"/>
+          </w:tcPr>
+          <w:p>
+            <w:pPr>
+              <w:pStyle w:val="ProgTableStrong"/>
+            </w:pPr>
+            <w:r>
+              <w:t>Ansible Basics</w:t>
+            </w:r>
+          </w:p>
+        </w:tc>
+        <w:tc>
+          <w:tcPr>
+            <w:tcW w:type="dxa" w:w="4876"/>
+          </w:tcPr>
+          <w:p>
+            <w:pPr>
+              <w:pStyle w:val="ProgTableText"/>
+            </w:pPr>
+            <w:r>
+              <w:t>Declarative vs imperative, configuration drift, architecture, static and AWS dynamic inventories, ad hoc commands</w:t>
+            </w:r>
+          </w:p>
+        </w:tc>
+        <w:tc>
+          <w:tcPr>
+            <w:tcW w:type="dxa" w:w="1134"/>
+          </w:tcPr>
+          <w:p>
+            <w:pPr>
+              <w:pStyle w:val="ProgTableMuted"/>
+            </w:pPr>
+            <w:r>
+              <w:t>Lecture + Lab</w:t>
+            </w:r>
+          </w:p>
+        </w:tc>
+        <w:tc>
+          <w:tcPr>
+            <w:tcW w:type="dxa" w:w="850"/>
+          </w:tcPr>
+          <w:p>
+            <w:pPr>
+              <w:pStyle w:val="ProgTableHours"/>
+            </w:pPr>
+            <w:r>
+              <w:t>3 h</w:t>
+            </w:r>
+          </w:p>
+        </w:tc>
+      </w:tr>
+      <w:tr>
+        <w:tc>
+          <w:tcPr>
+            <w:tcW w:type="dxa" w:w="567"/>
+          </w:tcPr>
+          <w:p>
+            <w:pPr>
+              <w:pStyle w:val="ProgTableId"/>
+            </w:pPr>
+            <w:r>
+              <w:t>3.6</w:t>
+            </w:r>
+          </w:p>
+        </w:tc>
+        <w:tc>
+          <w:tcPr>
+            <w:tcW w:type="dxa" w:w="2211"/>
+          </w:tcPr>
+          <w:p>
+            <w:pPr>
+              <w:pStyle w:val="ProgTableStrong"/>
+            </w:pPr>
+            <w:r>
+              <w:t>Playbooks</w:t>
+            </w:r>
+          </w:p>
+        </w:tc>
+        <w:tc>
+          <w:tcPr>
+            <w:tcW w:type="dxa" w:w="4876"/>
+          </w:tcPr>
+          <w:p>
+            <w:pPr>
+              <w:pStyle w:val="ProgTableText"/>
+            </w:pPr>
+            <w:r>
+              <w:t>YAML, plays and tasks, core modules, handlers, conditionals, loops, idempotency</w:t>
+            </w:r>
+          </w:p>
+        </w:tc>
+        <w:tc>
+          <w:tcPr>
+            <w:tcW w:type="dxa" w:w="1134"/>
+          </w:tcPr>
+          <w:p>
+            <w:pPr>
+              <w:pStyle w:val="ProgTableMuted"/>
+            </w:pPr>
+            <w:r>
+              <w:t>Lecture + Lab</w:t>
+            </w:r>
+          </w:p>
+        </w:tc>
+        <w:tc>
+          <w:tcPr>
+            <w:tcW w:type="dxa" w:w="850"/>
+          </w:tcPr>
+          <w:p>
+            <w:pPr>
+              <w:pStyle w:val="ProgTableHours"/>
+            </w:pPr>
+            <w:r>
+              <w:t>3 h</w:t>
+            </w:r>
+          </w:p>
+        </w:tc>
+      </w:tr>
+      <w:tr>
+        <w:tc>
+          <w:tcPr>
+            <w:tcW w:type="dxa" w:w="567"/>
+          </w:tcPr>
+          <w:p>
+            <w:pPr>
+              <w:pStyle w:val="ProgTableId"/>
+            </w:pPr>
+            <w:r>
+              <w:t>3.7</w:t>
+            </w:r>
+          </w:p>
+        </w:tc>
+        <w:tc>
+          <w:tcPr>
+            <w:tcW w:type="dxa" w:w="2211"/>
+          </w:tcPr>
+          <w:p>
+            <w:pPr>
+              <w:pStyle w:val="ProgTableStrong"/>
+            </w:pPr>
+            <w:r>
+              <w:t>Variables, Templates &amp; Vault</w:t>
+            </w:r>
+          </w:p>
+        </w:tc>
+        <w:tc>
+          <w:tcPr>
+            <w:tcW w:type="dxa" w:w="4876"/>
+          </w:tcPr>
+          <w:p>
+            <w:pPr>
+              <w:pStyle w:val="ProgTableText"/>
+            </w:pPr>
+            <w:r>
+              <w:t>group_vars and host_vars, facts, Jinja2 templates and filters, Ansible Vault for secrets</w:t>
+            </w:r>
+          </w:p>
+        </w:tc>
+        <w:tc>
+          <w:tcPr>
+            <w:tcW w:type="dxa" w:w="1134"/>
+          </w:tcPr>
+          <w:p>
+            <w:pPr>
+              <w:pStyle w:val="ProgTableMuted"/>
+            </w:pPr>
+            <w:r>
+              <w:t>Lecture + Lab</w:t>
+            </w:r>
+          </w:p>
+        </w:tc>
+        <w:tc>
+          <w:tcPr>
+            <w:tcW w:type="dxa" w:w="850"/>
+          </w:tcPr>
+          <w:p>
+            <w:pPr>
+              <w:pStyle w:val="ProgTableHours"/>
+            </w:pPr>
+            <w:r>
+              <w:t>3 h</w:t>
+            </w:r>
+          </w:p>
+        </w:tc>
+      </w:tr>
+      <w:tr>
+        <w:tc>
+          <w:tcPr>
+            <w:tcW w:type="dxa" w:w="567"/>
+          </w:tcPr>
+          <w:p>
+            <w:pPr>
+              <w:pStyle w:val="ProgTableId"/>
+            </w:pPr>
+            <w:r>
+              <w:t>3.8</w:t>
             </w:r>
           </w:p>
         </w:tc>
@@ -2536,275 +2902,7 @@
               <w:pStyle w:val="ProgTableHours"/>
             </w:pPr>
             <w:r>
-              <w:t>3 h</w:t>
-            </w:r>
-          </w:p>
-        </w:tc>
-      </w:tr>
-      <w:tr>
-        <w:tc>
-          <w:tcPr>
-            <w:tcW w:type="dxa" w:w="567"/>
-          </w:tcPr>
-          <w:p>
-            <w:pPr>
-              <w:pStyle w:val="ProgTableId"/>
-            </w:pPr>
-            <w:r>
-              <w:t>3.5</w:t>
-            </w:r>
-          </w:p>
-        </w:tc>
-        <w:tc>
-          <w:tcPr>
-            <w:tcW w:type="dxa" w:w="2211"/>
-          </w:tcPr>
-          <w:p>
-            <w:pPr>
-              <w:pStyle w:val="ProgTableStrong"/>
-            </w:pPr>
-            <w:r>
-              <w:t>Ansible Project</w:t>
-            </w:r>
-          </w:p>
-        </w:tc>
-        <w:tc>
-          <w:tcPr>
-            <w:tcW w:type="dxa" w:w="4876"/>
-          </w:tcPr>
-          <w:p>
-            <w:pPr>
-              <w:pStyle w:val="ProgTableText"/>
-            </w:pPr>
-            <w:r>
-              <w:t>Configure a multi-server web stack: web server, application, database, TLS</w:t>
-            </w:r>
-          </w:p>
-        </w:tc>
-        <w:tc>
-          <w:tcPr>
-            <w:tcW w:type="dxa" w:w="1134"/>
-          </w:tcPr>
-          <w:p>
-            <w:pPr>
-              <w:pStyle w:val="ProgTableMuted"/>
-            </w:pPr>
-            <w:r>
-              <w:t>Lab</w:t>
-            </w:r>
-          </w:p>
-        </w:tc>
-        <w:tc>
-          <w:tcPr>
-            <w:tcW w:type="dxa" w:w="850"/>
-          </w:tcPr>
-          <w:p>
-            <w:pPr>
-              <w:pStyle w:val="ProgTableHours"/>
-            </w:pPr>
-            <w:r>
-              <w:t>1.5 h</w:t>
-            </w:r>
-          </w:p>
-        </w:tc>
-      </w:tr>
-      <w:tr>
-        <w:tc>
-          <w:tcPr>
-            <w:tcW w:type="dxa" w:w="567"/>
-          </w:tcPr>
-          <w:p>
-            <w:pPr>
-              <w:pStyle w:val="ProgTableId"/>
-            </w:pPr>
-            <w:r>
-              <w:t>3.6</w:t>
-            </w:r>
-          </w:p>
-        </w:tc>
-        <w:tc>
-          <w:tcPr>
-            <w:tcW w:type="dxa" w:w="2211"/>
-          </w:tcPr>
-          <w:p>
-            <w:pPr>
-              <w:pStyle w:val="ProgTableStrong"/>
-            </w:pPr>
-            <w:r>
-              <w:t>Terraform Foundations</w:t>
-            </w:r>
-          </w:p>
-        </w:tc>
-        <w:tc>
-          <w:tcPr>
-            <w:tcW w:type="dxa" w:w="4876"/>
-          </w:tcPr>
-          <w:p>
-            <w:pPr>
-              <w:pStyle w:val="ProgTableText"/>
-            </w:pPr>
-            <w:r>
-              <w:t>Providers, HCL syntax, resources, data sources, dependency graph, plan and apply</w:t>
-            </w:r>
-          </w:p>
-        </w:tc>
-        <w:tc>
-          <w:tcPr>
-            <w:tcW w:type="dxa" w:w="1134"/>
-          </w:tcPr>
-          <w:p>
-            <w:pPr>
-              <w:pStyle w:val="ProgTableMuted"/>
-            </w:pPr>
-            <w:r>
-              <w:t>Lecture + Lab</w:t>
-            </w:r>
-          </w:p>
-        </w:tc>
-        <w:tc>
-          <w:tcPr>
-            <w:tcW w:type="dxa" w:w="850"/>
-          </w:tcPr>
-          <w:p>
-            <w:pPr>
-              <w:pStyle w:val="ProgTableHours"/>
-            </w:pPr>
-            <w:r>
-              <w:t>3 h</w:t>
-            </w:r>
-          </w:p>
-        </w:tc>
-      </w:tr>
-      <w:tr>
-        <w:tc>
-          <w:tcPr>
-            <w:tcW w:type="dxa" w:w="567"/>
-          </w:tcPr>
-          <w:p>
-            <w:pPr>
-              <w:pStyle w:val="ProgTableId"/>
-            </w:pPr>
-            <w:r>
-              <w:t>3.7</w:t>
-            </w:r>
-          </w:p>
-        </w:tc>
-        <w:tc>
-          <w:tcPr>
-            <w:tcW w:type="dxa" w:w="2211"/>
-          </w:tcPr>
-          <w:p>
-            <w:pPr>
-              <w:pStyle w:val="ProgTableStrong"/>
-            </w:pPr>
-            <w:r>
-              <w:t>Terraform State &amp; Variables</w:t>
-            </w:r>
-          </w:p>
-        </w:tc>
-        <w:tc>
-          <w:tcPr>
-            <w:tcW w:type="dxa" w:w="4876"/>
-          </w:tcPr>
-          <w:p>
-            <w:pPr>
-              <w:pStyle w:val="ProgTableText"/>
-            </w:pPr>
-            <w:r>
-              <w:t>Variables and validation, outputs, state, remote backends and state locking</w:t>
-            </w:r>
-          </w:p>
-        </w:tc>
-        <w:tc>
-          <w:tcPr>
-            <w:tcW w:type="dxa" w:w="1134"/>
-          </w:tcPr>
-          <w:p>
-            <w:pPr>
-              <w:pStyle w:val="ProgTableMuted"/>
-            </w:pPr>
-            <w:r>
-              <w:t>Lecture + Lab</w:t>
-            </w:r>
-          </w:p>
-        </w:tc>
-        <w:tc>
-          <w:tcPr>
-            <w:tcW w:type="dxa" w:w="850"/>
-          </w:tcPr>
-          <w:p>
-            <w:pPr>
-              <w:pStyle w:val="ProgTableHours"/>
-            </w:pPr>
-            <w:r>
-              <w:t>3 h</w:t>
-            </w:r>
-          </w:p>
-        </w:tc>
-      </w:tr>
-      <w:tr>
-        <w:tc>
-          <w:tcPr>
-            <w:tcW w:type="dxa" w:w="567"/>
-          </w:tcPr>
-          <w:p>
-            <w:pPr>
-              <w:pStyle w:val="ProgTableId"/>
-            </w:pPr>
-            <w:r>
-              <w:t>3.8</w:t>
-            </w:r>
-          </w:p>
-        </w:tc>
-        <w:tc>
-          <w:tcPr>
-            <w:tcW w:type="dxa" w:w="2211"/>
-          </w:tcPr>
-          <w:p>
-            <w:pPr>
-              <w:pStyle w:val="ProgTableStrong"/>
-            </w:pPr>
-            <w:r>
-              <w:t>Modules &amp; Environments</w:t>
-            </w:r>
-          </w:p>
-        </w:tc>
-        <w:tc>
-          <w:tcPr>
-            <w:tcW w:type="dxa" w:w="4876"/>
-          </w:tcPr>
-          <w:p>
-            <w:pPr>
-              <w:pStyle w:val="ProgTableText"/>
-            </w:pPr>
-            <w:r>
-              <w:t>Writing and versioning modules, workspaces, import of existing resources, code organisation</w:t>
-            </w:r>
-          </w:p>
-        </w:tc>
-        <w:tc>
-          <w:tcPr>
-            <w:tcW w:type="dxa" w:w="1134"/>
-          </w:tcPr>
-          <w:p>
-            <w:pPr>
-              <w:pStyle w:val="ProgTableMuted"/>
-            </w:pPr>
-            <w:r>
-              <w:t>Lecture + Lab</w:t>
-            </w:r>
-          </w:p>
-        </w:tc>
-        <w:tc>
-          <w:tcPr>
-            <w:tcW w:type="dxa" w:w="850"/>
-          </w:tcPr>
-          <w:p>
-            <w:pPr>
-              <w:pStyle w:val="ProgTableHours"/>
-            </w:pPr>
-            <w:r>
-              <w:t>3 h</w:t>
+              <w:t>1.5 h</w:t>
             </w:r>
           </w:p>
         </w:tc>
@@ -2832,7 +2930,7 @@
               <w:pStyle w:val="ProgTableStrong"/>
             </w:pPr>
             <w:r>
-              <w:t>Terraform Project</w:t>
+              <w:t>Ansible Project</w:t>
             </w:r>
           </w:p>
         </w:tc>
@@ -2845,7 +2943,7 @@
               <w:pStyle w:val="ProgTableText"/>
             </w:pPr>
             <w:r>
-              <w:t>Provision the cloud environment (network, compute, database) for the course application</w:t>
+              <w:t>Configure the EC2 tool servers (Jenkins agents, SonarQube, Nexus) with roles, then rerun to prove idempotency</w:t>
             </w:r>
           </w:p>
         </w:tc>
@@ -2871,7 +2969,7 @@
               <w:pStyle w:val="ProgTableHours"/>
             </w:pPr>
             <w:r>
-              <w:t>3 h</w:t>
+              <w:t>1.5 h</w:t>
             </w:r>
           </w:p>
         </w:tc>
@@ -2898,7 +2996,7 @@
       <w:r>
         <w:t>Phase 04</w:t>
         <w:tab/>
-        <w:t>6 h</w:t>
+        <w:t>6 h</w:t>
       </w:r>
     </w:p>
     <w:p>
@@ -2914,7 +3012,7 @@
         <w:pStyle w:val="ProgIntro"/>
       </w:pPr>
       <w:r>
-        <w:t>A delivery chain is only finished when the team can see what runs in production. Participants instrument the course application, write the queries behind useful dashboards and turn them into alerts.</w:t>
+        <w:t>A delivery chain is only finished when the team can see what runs in production. Participants instrument the course application, build dashboards from metrics and logs, and route alerts to the right people.</w:t>
       </w:r>
     </w:p>
     <w:tbl>
@@ -3023,7 +3121,7 @@
               <w:pStyle w:val="ProgTableStrong"/>
             </w:pPr>
             <w:r>
-              <w:t>Prometheus</w:t>
+              <w:t>Metrics &amp; Alerting with Prometheus</w:t>
             </w:r>
           </w:p>
         </w:tc>
@@ -3036,7 +3134,7 @@
               <w:pStyle w:val="ProgTableText"/>
             </w:pPr>
             <w:r>
-              <w:t>Metrics model, exporters, service discovery, PromQL, recording and alerting rules</w:t>
+              <w:t>Metrics model, exporters, instrumenting the application with client libraries, PromQL, recording and alerting rules, Alertmanager routing</w:t>
             </w:r>
           </w:p>
         </w:tc>
@@ -3062,7 +3160,7 @@
               <w:pStyle w:val="ProgTableHours"/>
             </w:pPr>
             <w:r>
-              <w:t>3 h</w:t>
+              <w:t>3 h</w:t>
             </w:r>
           </w:p>
         </w:tc>
@@ -3090,7 +3188,7 @@
               <w:pStyle w:val="ProgTableStrong"/>
             </w:pPr>
             <w:r>
-              <w:t>Grafana</w:t>
+              <w:t>Dashboards &amp; Logs with Grafana</w:t>
             </w:r>
           </w:p>
         </w:tc>
@@ -3103,7 +3201,7 @@
               <w:pStyle w:val="ProgTableText"/>
             </w:pPr>
             <w:r>
-              <w:t>Data sources, dashboards, alerting and notification channels, service level objectives</w:t>
+              <w:t>Dashboards, Loki for logs, Grafana alert rules, contact points and notification policies, service level objectives</w:t>
             </w:r>
           </w:p>
         </w:tc>
@@ -3129,7 +3227,7 @@
               <w:pStyle w:val="ProgTableHours"/>
             </w:pPr>
             <w:r>
-              <w:t>3 h</w:t>
+              <w:t>3 h</w:t>
             </w:r>
           </w:p>
         </w:tc>
@@ -3156,7 +3254,7 @@
       <w:r>
         <w:t>Phase 05</w:t>
         <w:tab/>
-        <w:t>9 h</w:t>
+        <w:t>9 h</w:t>
       </w:r>
     </w:p>
     <w:p>
@@ -3320,7 +3418,7 @@
               <w:pStyle w:val="ProgTableHours"/>
             </w:pPr>
             <w:r>
-              <w:t>1.5 h</w:t>
+              <w:t>1.5 h</w:t>
             </w:r>
           </w:p>
         </w:tc>
@@ -3361,7 +3459,7 @@
               <w:pStyle w:val="ProgTableText"/>
             </w:pPr>
             <w:r>
-              <w:t>Git workflow, CI pipeline with quality gate and artifacts, infrastructure with Terraform and Ansible, deployment to Kubernetes</w:t>
+              <w:t>Git workflow; CI with tests, quality gate and versioned artifacts; AWS infrastructure with Terraform; tool servers configured by Ansible; deployment to EKS with a rollout strategy</w:t>
             </w:r>
           </w:p>
         </w:tc>
@@ -3387,7 +3485,7 @@
               <w:pStyle w:val="ProgTableHours"/>
             </w:pPr>
             <w:r>
-              <w:t>4.5 h</w:t>
+              <w:t>4.5 h</w:t>
             </w:r>
           </w:p>
         </w:tc>
@@ -3428,7 +3526,7 @@
               <w:pStyle w:val="ProgTableText"/>
             </w:pPr>
             <w:r>
-              <w:t>Dashboards and alerts, README, architecture diagram, runbook</w:t>
+              <w:t>Metrics, logs, dashboards and alerts; README, architecture diagram, runbook</w:t>
             </w:r>
           </w:p>
         </w:tc>
@@ -3454,7 +3552,7 @@
               <w:pStyle w:val="ProgTableHours"/>
             </w:pPr>
             <w:r>
-              <w:t>1.5 h</w:t>
+              <w:t>1.5 h</w:t>
             </w:r>
           </w:p>
         </w:tc>
@@ -3495,7 +3593,7 @@
               <w:pStyle w:val="ProgTableText"/>
             </w:pPr>
             <w:r>
-              <w:t>Live demo of a change going from commit to production, questions, feedback</w:t>
+              <w:t>Live demo of a change going from commit to production, then a rollback; questions and feedback</w:t>
             </w:r>
           </w:p>
         </w:tc>
@@ -3521,7 +3619,7 @@
               <w:pStyle w:val="ProgTableHours"/>
             </w:pPr>
             <w:r>
-              <w:t>1.5 h</w:t>
+              <w:t>1.5 h</w:t>
             </w:r>
           </w:p>
         </w:tc>
@@ -3537,7 +3635,7 @@
         <w:pStyle w:val="ProgBoxTag"/>
       </w:pPr>
       <w:r>
-        <w:t>Project 1</w:t>
+        <w:t>Final project</w:t>
       </w:r>
     </w:p>
     <w:p>
@@ -3553,7 +3651,7 @@
         <w:pStyle w:val="ProgBoxText"/>
       </w:pPr>
       <w:r>
-        <w:t>A change pushed to Git is tested, analysed, versioned and deployed automatically to infrastructure that the team provisioned in code, and its health is visible on a dashboard with alerts.</w:t>
+        <w:t>A change pushed to Git is tested, analysed, versioned and deployed automatically to AWS infrastructure that the team provisioned in code. Its health is visible on dashboards with alerts, and a bad release can be rolled back.</w:t>
       </w:r>
     </w:p>
     <w:p>
@@ -3567,7 +3665,7 @@
         <w:t>Stack</w:t>
       </w:r>
       <w:r>
-        <w:t xml:space="preserve">  Git, GitHub, Jenkins or GitHub Actions, SonarQube, Nexus, Terraform, Ansible, Docker, Kubernetes, Prometheus, Grafana</w:t>
+        <w:t xml:space="preserve">  Git, GitHub, Jenkins or GitHub Actions, SonarQube, Nexus, Terraform, Ansible, Docker, Kubernetes (EKS), Helm, Prometheus, Grafana, Loki</w:t>
       </w:r>
     </w:p>
     <w:p>

</xml_diff>

<commit_message>
DevOps pilot: apply the whole-plan cold read; generator enforces hours rules
- Certifications with current exam versions, qualified as core topics
  (Terraform Associate 004, GH-200, LPI DevOps Tools Engineer 2.0 701-200)
- Lab environment: local phases 1-2, AWS from phase 3, one account per team, teardown
- Validated lab named in each phase; final project on 3 h session boundaries
- GitHub Actions custom actions and org policies, OpenTelemetry, DORA rework rate,
  Jenkins controller in the Ansible project; French titles for cited courses and IaC phase
- build_programmes.py: check() refuses chapter/phase/session/buffer/duration mismatches;
  phases start a page via the Prog Kicker style (no stray blank page); project box
  aligned with the tables; certification names do not wrap inside a name

Co-Authored-By: Claude Opus 5.5 <noreply@anthropic.com>
</commit_message>
<xml_diff>
--- a/res/programmes/DevOps-Engineering-81h.docx
+++ b/res/programmes/DevOps-Engineering-81h.docx
@@ -106,7 +106,7 @@
         <w:t>Prepares for</w:t>
       </w:r>
       <w:r>
-        <w:t xml:space="preserve">   HashiCorp Terraform Associate  ·  GitHub Actions (GH-200)  ·  LPI DevOps Tools Engineer (core topics)</w:t>
+        <w:t xml:space="preserve">   HashiCorp Terraform Associate (004), core topics  ·  GitHub Actions (GH‑200), core topics  ·  LPI DevOps Tools Engineer 2.0 (701‑200), core topics</w:t>
       </w:r>
     </w:p>
     <w:tbl>
@@ -866,7 +866,7 @@
               <w:pStyle w:val="ProgTableText"/>
             </w:pPr>
             <w:r>
-              <w:t>One laptop per participant (16 GB RAM, Docker, VS Code) and an AWS sandbox account per participant, provided by the organiser</w:t>
+              <w:t>One laptop per participant (16 GB RAM minimum, Docker, VS Code); phases 1 and 2 run locally, phase 3 moves the stack to AWS. One AWS sandbox account per team, provided by the organiser; resources destroyed after each session to control cost</w:t>
             </w:r>
           </w:p>
         </w:tc>
@@ -930,20 +930,6 @@
     </w:tbl>
     <w:p>
       <w:pPr>
-        <w:pStyle w:val="ProgBody"/>
-      </w:pPr>
-    </w:p>
-    <w:p>
-      <w:pPr>
-        <w:pStyle w:val="ProgBody"/>
-        <w:spacing w:after="0"/>
-      </w:pPr>
-      <w:r>
-        <w:br w:type="page"/>
-      </w:r>
-    </w:p>
-    <w:p>
-      <w:pPr>
         <w:pStyle w:val="ProgKicker"/>
       </w:pPr>
       <w:r>
@@ -965,7 +951,7 @@
         <w:pStyle w:val="ProgIntro"/>
       </w:pPr>
       <w:r>
-        <w:t>DevOps starts with how a team works, then with how it shares code. This phase sets the vocabulary and metrics used for the rest of the programme and gives every participant a working command of Git and pull-request based collaboration.</w:t>
+        <w:t>DevOps starts with how a team works, then with how it shares code. This phase sets the vocabulary and metrics used for the rest of the programme and gives every participant a working command of Git and pull-request based collaboration. The phase ends with a validated lab: a team repository with protected branches, a reviewed pull request and a tagged release.</w:t>
       </w:r>
     </w:p>
     <w:tbl>
@@ -1087,7 +1073,7 @@
               <w:pStyle w:val="ProgTableText"/>
             </w:pPr>
             <w:r>
-              <w:t>CALMS, DORA software delivery metrics, Agile and Kanban, value stream mapping, where automation pays off</w:t>
+              <w:t>CALMS, DORA software delivery metrics (throughput and instability, including rework rate), Agile and Kanban, value stream mapping, where automation pays off</w:t>
             </w:r>
           </w:p>
         </w:tc>
@@ -1389,20 +1375,6 @@
     </w:tbl>
     <w:p>
       <w:pPr>
-        <w:pStyle w:val="ProgBody"/>
-      </w:pPr>
-    </w:p>
-    <w:p>
-      <w:pPr>
-        <w:pStyle w:val="ProgBody"/>
-        <w:spacing w:after="0"/>
-      </w:pPr>
-      <w:r>
-        <w:br w:type="page"/>
-      </w:r>
-    </w:p>
-    <w:p>
-      <w:pPr>
         <w:pStyle w:val="ProgKicker"/>
       </w:pPr>
       <w:r>
@@ -1424,7 +1396,7 @@
         <w:pStyle w:val="ProgIntro"/>
       </w:pPr>
       <w:r>
-        <w:t>Participants build the same pipeline twice: on Jenkins, the most widespread self-hosted CI server, and on GitHub Actions. Tests, quality gates and an artifact repository make sure that only tested, versioned builds are deployed, and the phase ends with the release strategies that keep a deployment reversible.</w:t>
+        <w:t>Participants build the same pipeline twice: on Jenkins, a widely used self-hosted CI server, and on GitHub Actions. Tests, quality gates and an artifact repository make sure that only tested, versioned builds are deployed, and the phase ends with the release strategies that keep a deployment reversible. Validated lab: the course application built, tested, analysed, published to Nexus and deployed to the local cluster by both pipelines.</w:t>
       </w:r>
     </w:p>
     <w:tbl>
@@ -2149,7 +2121,7 @@
               <w:pStyle w:val="ProgTableText"/>
             </w:pPr>
             <w:r>
-              <w:t>Workflows, events, jobs and steps, hosted and self-hosted runners, matrix builds, caching</w:t>
+              <w:t>Workflows, events, jobs and steps, expressions and contexts, hosted and self-hosted runners, matrix builds, caching, artifacts</w:t>
             </w:r>
           </w:p>
         </w:tc>
@@ -2203,7 +2175,7 @@
               <w:pStyle w:val="ProgTableStrong"/>
             </w:pPr>
             <w:r>
-              <w:t>Secure Delivery with Actions</w:t>
+              <w:t>Secure Delivery &amp; Reuse with Actions</w:t>
             </w:r>
           </w:p>
         </w:tc>
@@ -2216,7 +2188,7 @@
               <w:pStyle w:val="ProgTableText"/>
             </w:pPr>
             <w:r>
-              <w:t>Secrets, environments and required reviewers, OIDC federation to AWS without long-lived keys, reusable workflows, deployment</w:t>
+              <w:t>Secrets, environments and required reviewers, OIDC federation to AWS without long-lived keys, reusable workflows, custom composite, JavaScript and Docker actions, organisation policies and runner groups</w:t>
             </w:r>
           </w:p>
         </w:tc>
@@ -2250,20 +2222,6 @@
     </w:tbl>
     <w:p>
       <w:pPr>
-        <w:pStyle w:val="ProgBody"/>
-      </w:pPr>
-    </w:p>
-    <w:p>
-      <w:pPr>
-        <w:pStyle w:val="ProgBody"/>
-        <w:spacing w:after="0"/>
-      </w:pPr>
-      <w:r>
-        <w:br w:type="page"/>
-      </w:r>
-    </w:p>
-    <w:p>
-      <w:pPr>
         <w:pStyle w:val="ProgKicker"/>
       </w:pPr>
       <w:r>
@@ -2285,7 +2243,7 @@
         <w:pStyle w:val="ProgIntro"/>
       </w:pPr>
       <w:r>
-        <w:t>Infrastructure is described in code, reviewed like code and applied by the pipeline. Terraform creates the AWS environment for the course application; Ansible then configures the servers that run the team's tooling. Each tool ends with a project that the final project reuses.</w:t>
+        <w:t>Infrastructure is described in code, reviewed like code and applied by the pipeline. Terraform creates the AWS environment for the course application; Ansible then configures the servers that run the team's tooling. Each tool ends with a validated project that the final project reuses.</w:t>
       </w:r>
     </w:p>
     <w:tbl>
@@ -2943,7 +2901,7 @@
               <w:pStyle w:val="ProgTableText"/>
             </w:pPr>
             <w:r>
-              <w:t>Configure the EC2 tool servers (Jenkins agents, SonarQube, Nexus) with roles, then rerun to prove idempotency</w:t>
+              <w:t>Configure the EC2 tool servers (Jenkins controller and agents, SonarQube, Nexus) with roles, then rerun to prove idempotency</w:t>
             </w:r>
           </w:p>
         </w:tc>
@@ -2977,20 +2935,6 @@
     </w:tbl>
     <w:p>
       <w:pPr>
-        <w:pStyle w:val="ProgBody"/>
-      </w:pPr>
-    </w:p>
-    <w:p>
-      <w:pPr>
-        <w:pStyle w:val="ProgBody"/>
-        <w:spacing w:after="0"/>
-      </w:pPr>
-      <w:r>
-        <w:br w:type="page"/>
-      </w:r>
-    </w:p>
-    <w:p>
-      <w:pPr>
         <w:pStyle w:val="ProgKicker"/>
       </w:pPr>
       <w:r>
@@ -3012,7 +2956,7 @@
         <w:pStyle w:val="ProgIntro"/>
       </w:pPr>
       <w:r>
-        <w:t>A delivery chain is only finished when the team can see what runs in production. Participants instrument the course application, build dashboards from metrics and logs, and route alerts to the right people.</w:t>
+        <w:t>A delivery chain is only finished when the team can see what runs in production. Participants instrument the course application, build dashboards from metrics and logs, and route alerts to the right people. Validated lab: a dashboard for the course application and an alert that fires and reaches its contact point.</w:t>
       </w:r>
     </w:p>
     <w:tbl>
@@ -3134,7 +3078,7 @@
               <w:pStyle w:val="ProgTableText"/>
             </w:pPr>
             <w:r>
-              <w:t>Metrics model, exporters, instrumenting the application with client libraries, PromQL, recording and alerting rules, Alertmanager routing</w:t>
+              <w:t>Metrics model, exporters, instrumenting the application with OpenTelemetry and Prometheus client libraries, PromQL, recording and alerting rules, Alertmanager routing</w:t>
             </w:r>
           </w:p>
         </w:tc>
@@ -3233,20 +3177,6 @@
         </w:tc>
       </w:tr>
     </w:tbl>
-    <w:p>
-      <w:pPr>
-        <w:pStyle w:val="ProgBody"/>
-      </w:pPr>
-    </w:p>
-    <w:p>
-      <w:pPr>
-        <w:pStyle w:val="ProgBody"/>
-        <w:spacing w:after="0"/>
-      </w:pPr>
-      <w:r>
-        <w:br w:type="page"/>
-      </w:r>
-    </w:p>
     <w:p>
       <w:pPr>
         <w:pStyle w:val="ProgKicker"/>
@@ -3392,7 +3322,7 @@
               <w:pStyle w:val="ProgTableText"/>
             </w:pPr>
             <w:r>
-              <w:t>Read the brief, draw the target architecture, split the work into a backlog</w:t>
+              <w:t>Read the brief, draw the target architecture, split the work into a backlog, set up the team repository and AWS environment from the phase projects</w:t>
             </w:r>
           </w:p>
         </w:tc>
@@ -3418,7 +3348,7 @@
               <w:pStyle w:val="ProgTableHours"/>
             </w:pPr>
             <w:r>
-              <w:t>1.5 h</w:t>
+              <w:t>3 h</w:t>
             </w:r>
           </w:p>
         </w:tc>
@@ -3485,7 +3415,7 @@
               <w:pStyle w:val="ProgTableHours"/>
             </w:pPr>
             <w:r>
-              <w:t>4.5 h</w:t>
+              <w:t>3 h</w:t>
             </w:r>
           </w:p>
         </w:tc>
@@ -3683,11 +3613,6 @@
         <w:t xml:space="preserve">  Repository with pipeline and infrastructure code, architecture diagram, runbook, live demo</w:t>
       </w:r>
     </w:p>
-    <w:p>
-      <w:pPr>
-        <w:pStyle w:val="ProgBody"/>
-      </w:pPr>
-    </w:p>
     <w:sectPr>
       <w:headerReference w:type="default" r:id="rId9"/>
       <w:footerReference w:type="default" r:id="rId10"/>
@@ -15925,6 +15850,7 @@
     <w:qFormat/>
     <w:pPr>
       <w:keepNext/>
+      <w:pageBreakBefore/>
       <w:tabs>
         <w:tab w:pos="9638" w:val="right"/>
       </w:tabs>
@@ -16211,6 +16137,7 @@
     <w:pPr>
       <w:keepNext/>
       <w:spacing w:before="0" w:after="0" w:line="276" w:lineRule="auto"/>
+      <w:ind w:left="260" w:right="210"/>
       <w:pBdr>
         <w:top w:val="single" w:sz="4" w:space="6" w:color="FBF4E2"/>
         <w:left w:val="single" w:sz="24" w:space="10" w:color="D4A024"/>
@@ -16235,6 +16162,7 @@
     <w:pPr>
       <w:keepNext/>
       <w:spacing w:before="0" w:after="80" w:line="276" w:lineRule="auto"/>
+      <w:ind w:left="260" w:right="210"/>
       <w:pBdr>
         <w:top w:val="single" w:sz="4" w:space="6" w:color="FBF4E2"/>
         <w:left w:val="single" w:sz="24" w:space="10" w:color="D4A024"/>
@@ -16256,6 +16184,7 @@
     <w:pPr>
       <w:keepNext/>
       <w:spacing w:before="0" w:after="60" w:line="276" w:lineRule="auto"/>
+      <w:ind w:left="260" w:right="210"/>
       <w:pBdr>
         <w:top w:val="single" w:sz="4" w:space="6" w:color="FBF4E2"/>
         <w:left w:val="single" w:sz="24" w:space="10" w:color="D4A024"/>

</xml_diff>

<commit_message>
Programmes: state hours only, no session counts in Duration
Co-Authored-By: Claude Opus 5.5 <noreply@anthropic.com>
</commit_message>
<xml_diff>
--- a/res/programmes/DevOps-Engineering-81h.docx
+++ b/res/programmes/DevOps-Engineering-81h.docx
@@ -810,7 +810,7 @@
               <w:pStyle w:val="ProgTableText"/>
             </w:pPr>
             <w:r>
-              <w:t>81 h: 72 h of chapters + 9 h buffer, in 27 sessions of 3 h</w:t>
+              <w:t>81 h: 72 h of chapters + 9 h buffer</w:t>
             </w:r>
           </w:p>
         </w:tc>
@@ -866,7 +866,7 @@
               <w:pStyle w:val="ProgTableText"/>
             </w:pPr>
             <w:r>
-              <w:t>One laptop per participant (16 GB RAM minimum, Docker, VS Code); phases 1 and 2 run locally, phase 3 moves the stack to AWS. One AWS sandbox account per team, provided by the organiser; resources destroyed after each session to control cost</w:t>
+              <w:t>One laptop per participant (16 GB RAM minimum, Docker, VS Code); phases 1 and 2 run locally, phase 3 moves the stack to AWS. One AWS sandbox account per team, provided by the organiser; resources destroyed at the end of each lab to control cost</w:t>
             </w:r>
           </w:p>
         </w:tc>

</xml_diff>